<commit_message>
H1 selalu di awal halaman + hilangkan baris judul pengadaan
- Setiap Heading 1 (section 2-4) didahului paragraf kosong berisi manual page break
  (<w:br w:type="page"/>), mengikuti pola file acuan 'Solution Pack Pussiberad 2027 V1.1'.
  Section 1 tetap di halaman judul.
- Generator hanya menulis satu baris judul: "SOLUTION PACK DOCUMENT" (opsi title_line
  dihapus; meta.title hanya untuk document properties).
- qc.py: tambah cek page break sebelum tiap H1 (dan paragraf pembawa break harus kosong).
- _verify_dev.py: tambah cek XML-level untuk page break yang sama.
- references/style-spec.md, references/qc-checklist.md, SKILL.md: dokumentasi aturan baru.
- Regenerate templates/sample-output.docx.
- Verifikasi: QC PASS, _verify_dev ALL PASS, 9 negative input test pass.
</commit_message>
<xml_diff>
--- a/templates/sample-output.docx
+++ b/templates/sample-output.docx
@@ -426,6 +426,11 @@
       </w:tr>
     </w:tbl>
     <w:p>
+      <w:r>
+        <w:br w:type="page"/>
+      </w:r>
+    </w:p>
+    <w:p>
       <w:pPr>
         <w:pStyle w:val="2"/>
       </w:pPr>
@@ -519,6 +524,11 @@
       </w:pPr>
       <w:r>
         <w:t>Menyediakan monitoring, alert, logging, reporting, dan pengolahan data untuk mendukung keputusan operasional.</w:t>
+      </w:r>
+    </w:p>
+    <w:p>
+      <w:r>
+        <w:br w:type="page"/>
       </w:r>
     </w:p>
     <w:p>
@@ -1092,6 +1102,11 @@
       </w:tr>
     </w:tbl>
     <w:p>
+      <w:r>
+        <w:br w:type="page"/>
+      </w:r>
+    </w:p>
+    <w:p>
       <w:pPr>
         <w:pStyle w:val="2"/>
       </w:pPr>

</xml_diff>